<commit_message>
update docx for localexceladdin
</commit_message>
<xml_diff>
--- a/source/_static/Usage Guide-MacOS-LocalExcelAddin.docx
+++ b/source/_static/Usage Guide-MacOS-LocalExcelAddin.docx
@@ -479,7 +479,109 @@
           <w:rFonts w:hint="default" w:ascii="Arial" w:hAnsi="Arial" w:cs="Arial"/>
           <w:lang w:val="en-US"/>
         </w:rPr>
-        <w:t>Questions, email he.yang@wtsolutions.cn</w:t>
+        <w:t xml:space="preserve">Questions, email </w:t>
+      </w:r>
+      <w:r>
+        <w:rPr>
+          <w:rFonts w:hint="default" w:ascii="Arial" w:hAnsi="Arial" w:cs="Arial"/>
+          <w:lang w:val="en-US"/>
+        </w:rPr>
+        <w:fldChar w:fldCharType="begin"/>
+      </w:r>
+      <w:r>
+        <w:rPr>
+          <w:rFonts w:hint="default" w:ascii="Arial" w:hAnsi="Arial" w:cs="Arial"/>
+          <w:lang w:val="en-US"/>
+        </w:rPr>
+        <w:instrText xml:space="preserve"> HYPERLINK "mailto:he.yang@wtsolutions.cn" </w:instrText>
+      </w:r>
+      <w:r>
+        <w:rPr>
+          <w:rFonts w:hint="default" w:ascii="Arial" w:hAnsi="Arial" w:cs="Arial"/>
+          <w:lang w:val="en-US"/>
+        </w:rPr>
+        <w:fldChar w:fldCharType="separate"/>
+      </w:r>
+      <w:r>
+        <w:rPr>
+          <w:rStyle w:val="18"/>
+          <w:rFonts w:hint="default" w:ascii="Arial" w:hAnsi="Arial" w:cs="Arial"/>
+          <w:lang w:val="en-US"/>
+        </w:rPr>
+        <w:t>he.yang@wtsolutions.cn</w:t>
+      </w:r>
+      <w:r>
+        <w:rPr>
+          <w:rFonts w:hint="default" w:ascii="Arial" w:hAnsi="Arial" w:cs="Arial"/>
+          <w:lang w:val="en-US"/>
+        </w:rPr>
+        <w:fldChar w:fldCharType="end"/>
+      </w:r>
+    </w:p>
+    <w:p>
+      <w:pPr>
+        <w:rPr>
+          <w:rFonts w:hint="default" w:ascii="Arial" w:hAnsi="Arial" w:cs="Arial"/>
+          <w:lang w:val="en-US"/>
+        </w:rPr>
+      </w:pPr>
+    </w:p>
+    <w:p>
+      <w:pPr>
+        <w:rPr>
+          <w:rFonts w:hint="default" w:ascii="Arial" w:hAnsi="Arial" w:cs="Arial"/>
+          <w:lang w:val="en-US"/>
+        </w:rPr>
+      </w:pPr>
+      <w:r>
+        <w:rPr>
+          <w:rFonts w:hint="default" w:ascii="Arial" w:hAnsi="Arial" w:cs="Arial"/>
+          <w:lang w:val="en-US"/>
+        </w:rPr>
+        <w:t xml:space="preserve">Documentation of Excel-to-JSON at </w:t>
+      </w:r>
+      <w:r>
+        <w:rPr>
+          <w:rFonts w:hint="default" w:ascii="Arial" w:hAnsi="Arial" w:cs="Arial"/>
+          <w:lang w:val="en-US"/>
+        </w:rPr>
+        <w:fldChar w:fldCharType="begin"/>
+      </w:r>
+      <w:r>
+        <w:rPr>
+          <w:rFonts w:hint="default" w:ascii="Arial" w:hAnsi="Arial" w:cs="Arial"/>
+          <w:lang w:val="en-US"/>
+        </w:rPr>
+        <w:instrText xml:space="preserve"> HYPERLINK "https://excel-to-json.wtsolutions.cn" </w:instrText>
+      </w:r>
+      <w:r>
+        <w:rPr>
+          <w:rFonts w:hint="default" w:ascii="Arial" w:hAnsi="Arial" w:cs="Arial"/>
+          <w:lang w:val="en-US"/>
+        </w:rPr>
+        <w:fldChar w:fldCharType="separate"/>
+      </w:r>
+      <w:r>
+        <w:rPr>
+          <w:rStyle w:val="18"/>
+          <w:rFonts w:hint="default" w:ascii="Arial" w:hAnsi="Arial" w:cs="Arial"/>
+          <w:lang w:val="en-US"/>
+        </w:rPr>
+        <w:t>https://excel-to-json.wtsolutions.cn</w:t>
+      </w:r>
+      <w:r>
+        <w:rPr>
+          <w:rFonts w:hint="default" w:ascii="Arial" w:hAnsi="Arial" w:cs="Arial"/>
+          <w:lang w:val="en-US"/>
+        </w:rPr>
+        <w:fldChar w:fldCharType="end"/>
+      </w:r>
+      <w:r>
+        <w:rPr>
+          <w:rFonts w:hint="default" w:ascii="Arial" w:hAnsi="Arial" w:cs="Arial"/>
+          <w:lang w:val="en-US"/>
+        </w:rPr>
+        <w:t xml:space="preserve"> </w:t>
       </w:r>
       <w:bookmarkStart w:id="0" w:name="_GoBack"/>
       <w:bookmarkEnd w:id="0"/>

</xml_diff>